<commit_message>
Initial commit - AeroFlow Django project
</commit_message>
<xml_diff>
--- a/Doc/3.index.docx
+++ b/Doc/3.index.docx
@@ -1285,6 +1285,14 @@
                 <w:szCs w:val="28"/>
               </w:rPr>
             </w:pPr>
+            <w:r>
+              <w:rPr>
+                <w:b/>
+                <w:sz w:val="26"/>
+                <w:szCs w:val="28"/>
+              </w:rPr>
+              <w:t>15</w:t>
+            </w:r>
           </w:p>
         </w:tc>
       </w:tr>
@@ -1364,6 +1372,14 @@
                 <w:szCs w:val="28"/>
               </w:rPr>
             </w:pPr>
+            <w:r>
+              <w:rPr>
+                <w:b/>
+                <w:sz w:val="26"/>
+                <w:szCs w:val="28"/>
+              </w:rPr>
+              <w:t>17</w:t>
+            </w:r>
           </w:p>
         </w:tc>
       </w:tr>
@@ -1436,6 +1452,14 @@
                 <w:szCs w:val="28"/>
               </w:rPr>
             </w:pPr>
+            <w:r>
+              <w:rPr>
+                <w:b/>
+                <w:sz w:val="26"/>
+                <w:szCs w:val="28"/>
+              </w:rPr>
+              <w:t>18</w:t>
+            </w:r>
           </w:p>
         </w:tc>
       </w:tr>
@@ -1508,6 +1532,14 @@
                 <w:szCs w:val="28"/>
               </w:rPr>
             </w:pPr>
+            <w:r>
+              <w:rPr>
+                <w:b/>
+                <w:sz w:val="26"/>
+                <w:szCs w:val="28"/>
+              </w:rPr>
+              <w:t>19</w:t>
+            </w:r>
           </w:p>
         </w:tc>
       </w:tr>
@@ -1808,6 +1840,14 @@
                 <w:szCs w:val="28"/>
               </w:rPr>
             </w:pPr>
+            <w:r>
+              <w:rPr>
+                <w:b/>
+                <w:sz w:val="26"/>
+                <w:szCs w:val="28"/>
+              </w:rPr>
+              <w:t>20</w:t>
+            </w:r>
           </w:p>
         </w:tc>
       </w:tr>
@@ -1880,6 +1920,14 @@
                 <w:szCs w:val="28"/>
               </w:rPr>
             </w:pPr>
+            <w:r>
+              <w:rPr>
+                <w:b/>
+                <w:sz w:val="26"/>
+                <w:szCs w:val="28"/>
+              </w:rPr>
+              <w:t>21</w:t>
+            </w:r>
           </w:p>
         </w:tc>
       </w:tr>
@@ -1952,6 +2000,14 @@
                 <w:szCs w:val="28"/>
               </w:rPr>
             </w:pPr>
+            <w:r>
+              <w:rPr>
+                <w:b/>
+                <w:sz w:val="26"/>
+                <w:szCs w:val="28"/>
+              </w:rPr>
+              <w:t>30</w:t>
+            </w:r>
           </w:p>
         </w:tc>
       </w:tr>
@@ -2024,6 +2080,14 @@
                 <w:szCs w:val="28"/>
               </w:rPr>
             </w:pPr>
+            <w:r>
+              <w:rPr>
+                <w:b/>
+                <w:sz w:val="26"/>
+                <w:szCs w:val="28"/>
+              </w:rPr>
+              <w:t>40</w:t>
+            </w:r>
           </w:p>
         </w:tc>
       </w:tr>
@@ -2105,6 +2169,14 @@
                 <w:szCs w:val="28"/>
               </w:rPr>
             </w:pPr>
+            <w:r>
+              <w:rPr>
+                <w:b/>
+                <w:sz w:val="26"/>
+                <w:szCs w:val="28"/>
+              </w:rPr>
+              <w:t>42</w:t>
+            </w:r>
           </w:p>
         </w:tc>
       </w:tr>
@@ -2177,6 +2249,14 @@
                 <w:szCs w:val="28"/>
               </w:rPr>
             </w:pPr>
+            <w:r>
+              <w:rPr>
+                <w:b/>
+                <w:sz w:val="26"/>
+                <w:szCs w:val="28"/>
+              </w:rPr>
+              <w:t>43</w:t>
+            </w:r>
           </w:p>
         </w:tc>
       </w:tr>
@@ -2249,6 +2329,14 @@
                 <w:szCs w:val="28"/>
               </w:rPr>
             </w:pPr>
+            <w:r>
+              <w:rPr>
+                <w:b/>
+                <w:sz w:val="26"/>
+                <w:szCs w:val="28"/>
+              </w:rPr>
+              <w:t>44</w:t>
+            </w:r>
           </w:p>
         </w:tc>
       </w:tr>
@@ -2334,6 +2422,14 @@
                 <w:szCs w:val="28"/>
               </w:rPr>
             </w:pPr>
+            <w:r>
+              <w:rPr>
+                <w:b/>
+                <w:sz w:val="26"/>
+                <w:szCs w:val="28"/>
+              </w:rPr>
+              <w:t>46</w:t>
+            </w:r>
           </w:p>
         </w:tc>
       </w:tr>
@@ -2419,6 +2515,14 @@
                 <w:szCs w:val="28"/>
               </w:rPr>
             </w:pPr>
+            <w:r>
+              <w:rPr>
+                <w:b/>
+                <w:sz w:val="26"/>
+                <w:szCs w:val="28"/>
+              </w:rPr>
+              <w:t>48</w:t>
+            </w:r>
           </w:p>
         </w:tc>
       </w:tr>
@@ -2504,6 +2608,14 @@
                 <w:szCs w:val="28"/>
               </w:rPr>
             </w:pPr>
+            <w:r>
+              <w:rPr>
+                <w:b/>
+                <w:sz w:val="26"/>
+                <w:szCs w:val="28"/>
+              </w:rPr>
+              <w:t>50</w:t>
+            </w:r>
           </w:p>
         </w:tc>
       </w:tr>

</xml_diff>